<commit_message>
Actualizar documentación del Sprint 2 y corregir ortografía y redacción
</commit_message>
<xml_diff>
--- a/Fase 2/Evidencias Grupales/2.4_GuiaEstudiante_Fase 2_DesarrolloProyecto APT (Español).docx
+++ b/Fase 2/Evidencias Grupales/2.4_GuiaEstudiante_Fase 2_DesarrolloProyecto APT (Español).docx
@@ -587,6 +587,83 @@
             <w:pPr>
               <w:numPr>
                 <w:ilvl w:val="0"/>
+                <w:numId w:val="6"/>
+              </w:numPr>
+              <w:spacing w:after="0" w:afterAutospacing="0"/>
+              <w:ind w:left="720" w:hanging="360"/>
+              <w:jc w:val="both"/>
+              <w:rPr>
+                <w:i w:val="1"/>
+                <w:iCs w:val="1"/>
+                <w:sz w:val="20"/>
+                <w:szCs w:val="20"/>
+                <w:u w:val="none"/>
+              </w:rPr>
+            </w:pPr>
+            <w:r>
+              <w:rPr>
+                <w:i w:val="1"/>
+                <w:iCs w:val="1"/>
+                <w:sz w:val="20"/>
+                <w:szCs w:val="20"/>
+                <w:rtl w:val="0"/>
+              </w:rPr>
+              <w:t xml:space="preserve">Reuniones con el cliente para establecer el scope del proyecto.</w:t>
+            </w:r>
+          </w:p>
+          <w:p>
+            <w:pPr>
+              <w:numPr>
+                <w:ilvl w:val="0"/>
+                <w:numId w:val="6"/>
+              </w:numPr>
+              <w:ind w:left="720" w:hanging="360"/>
+              <w:jc w:val="both"/>
+              <w:rPr>
+                <w:i w:val="1"/>
+                <w:iCs w:val="1"/>
+                <w:sz w:val="20"/>
+                <w:szCs w:val="20"/>
+                <w:u w:val="none"/>
+              </w:rPr>
+            </w:pPr>
+            <w:r>
+              <w:rPr>
+                <w:i w:val="1"/>
+                <w:iCs w:val="1"/>
+                <w:sz w:val="20"/>
+                <w:szCs w:val="20"/>
+                <w:rtl w:val="0"/>
+              </w:rPr>
+              <w:t xml:space="preserve">Documentación sobre las historias de usuario, módulos a desarrollar, product backlog, documentación de avances de estos en base al cronograma,  sprints reviews, retrospectives, backlogs, burndown chart, entre otros documentos.</w:t>
+            </w:r>
+          </w:p>
+          <w:p>
+            <w:pPr>
+              <w:ind w:left="0" w:firstLine="0"/>
+              <w:jc w:val="both"/>
+              <w:rPr>
+                <w:i w:val="1"/>
+                <w:iCs w:val="1"/>
+                <w:sz w:val="20"/>
+                <w:szCs w:val="20"/>
+              </w:rPr>
+            </w:pPr>
+            <w:r>
+              <w:rPr>
+                <w:i w:val="1"/>
+                <w:iCs w:val="1"/>
+                <w:sz w:val="20"/>
+                <w:szCs w:val="20"/>
+                <w:rtl w:val="0"/>
+              </w:rPr>
+              <w:t xml:space="preserve">En el apartado de desarrollo de la plataforma de gestión, se ha avanzado con los siguientes módulos:</w:t>
+            </w:r>
+          </w:p>
+          <w:p>
+            <w:pPr>
+              <w:numPr>
+                <w:ilvl w:val="0"/>
                 <w:numId w:val="4"/>
               </w:numPr>
               <w:spacing w:after="0" w:afterAutospacing="0"/>
@@ -608,7 +685,91 @@
                 <w:szCs w:val="20"/>
                 <w:rtl w:val="0"/>
               </w:rPr>
-              <w:t xml:space="preserve">Reuniones con el cliente para establecer el scope del proyecto.</w:t>
+              <w:t xml:space="preserve">Módulo de Visibilidad de Cliente (visualización de clientes).</w:t>
+            </w:r>
+          </w:p>
+          <w:p>
+            <w:pPr>
+              <w:numPr>
+                <w:ilvl w:val="0"/>
+                <w:numId w:val="4"/>
+              </w:numPr>
+              <w:spacing w:after="0" w:afterAutospacing="0"/>
+              <w:ind w:left="720" w:hanging="360"/>
+              <w:jc w:val="both"/>
+              <w:rPr>
+                <w:i w:val="1"/>
+                <w:iCs w:val="1"/>
+                <w:sz w:val="20"/>
+                <w:szCs w:val="20"/>
+                <w:u w:val="none"/>
+              </w:rPr>
+            </w:pPr>
+            <w:r>
+              <w:rPr>
+                <w:i w:val="1"/>
+                <w:iCs w:val="1"/>
+                <w:sz w:val="20"/>
+                <w:szCs w:val="20"/>
+                <w:rtl w:val="0"/>
+              </w:rPr>
+              <w:t xml:space="preserve">Módulo de Gestión de Clientes (Jefa de Taller puede administrar clientes).</w:t>
+            </w:r>
+          </w:p>
+          <w:p>
+            <w:pPr>
+              <w:numPr>
+                <w:ilvl w:val="0"/>
+                <w:numId w:val="4"/>
+              </w:numPr>
+              <w:spacing w:after="0" w:afterAutospacing="0"/>
+              <w:ind w:left="720" w:hanging="360"/>
+              <w:jc w:val="both"/>
+              <w:rPr>
+                <w:i w:val="1"/>
+                <w:iCs w:val="1"/>
+                <w:sz w:val="20"/>
+                <w:szCs w:val="20"/>
+                <w:u w:val="none"/>
+              </w:rPr>
+            </w:pPr>
+            <w:r>
+              <w:rPr>
+                <w:i w:val="1"/>
+                <w:iCs w:val="1"/>
+                <w:sz w:val="20"/>
+                <w:szCs w:val="20"/>
+                <w:rtl w:val="0"/>
+              </w:rPr>
+              <w:t xml:space="preserve">Módulo de Gestión de Pedidos (Administración de pedidos de prendas).</w:t>
+            </w:r>
+          </w:p>
+          <w:p>
+            <w:pPr>
+              <w:numPr>
+                <w:ilvl w:val="0"/>
+                <w:numId w:val="4"/>
+              </w:numPr>
+              <w:spacing w:after="0" w:afterAutospacing="0"/>
+              <w:ind w:left="720" w:hanging="360"/>
+              <w:jc w:val="both"/>
+              <w:rPr>
+                <w:i w:val="1"/>
+                <w:iCs w:val="1"/>
+                <w:sz w:val="20"/>
+                <w:szCs w:val="20"/>
+                <w:u w:val="none"/>
+              </w:rPr>
+            </w:pPr>
+            <w:r>
+              <w:rPr>
+                <w:i w:val="1"/>
+                <w:iCs w:val="1"/>
+                <w:sz w:val="20"/>
+                <w:szCs w:val="20"/>
+                <w:rtl w:val="0"/>
+              </w:rPr>
+              <w:t xml:space="preserve">Módulo de Flujo y Asignación de taller (Asignar trabajadores tareas).</w:t>
             </w:r>
           </w:p>
           <w:p>
@@ -635,7 +796,7 @@
                 <w:szCs w:val="20"/>
                 <w:rtl w:val="0"/>
               </w:rPr>
-              <w:t xml:space="preserve">Documentación sobre las historias de usuario, módulos a desarrollar, product backlog, documentación de avances de estos en base al cronograma,  sprints reviews, retrospectives, backlogs, burndown chart, entre otros documentos.</w:t>
+              <w:t xml:space="preserve">Módulo de Autenticación y Control de Accesos (Integración con Supabase para el manejo de cuentas).</w:t>
             </w:r>
           </w:p>
           <w:p>
@@ -657,7 +818,478 @@
                 <w:szCs w:val="20"/>
                 <w:rtl w:val="0"/>
               </w:rPr>
-              <w:t xml:space="preserve">En el apartado de desarrollo de la plataforma de gestión, se ha avanzado con los siguientes módulos:</w:t>
+              <w:t xml:space="preserve">Otras actividades relacionadas a los módulos son las siguientes:</w:t>
+            </w:r>
+          </w:p>
+          <w:p>
+            <w:pPr>
+              <w:numPr>
+                <w:ilvl w:val="0"/>
+                <w:numId w:val="2"/>
+              </w:numPr>
+              <w:spacing w:after="0" w:afterAutospacing="0"/>
+              <w:ind w:left="720" w:hanging="360"/>
+              <w:jc w:val="both"/>
+              <w:rPr>
+                <w:i w:val="1"/>
+                <w:iCs w:val="1"/>
+                <w:sz w:val="20"/>
+                <w:szCs w:val="20"/>
+                <w:u w:val="none"/>
+              </w:rPr>
+            </w:pPr>
+            <w:r>
+              <w:rPr>
+                <w:i w:val="1"/>
+                <w:iCs w:val="1"/>
+                <w:sz w:val="20"/>
+                <w:szCs w:val="20"/>
+                <w:rtl w:val="0"/>
+              </w:rPr>
+              <w:t xml:space="preserve">Levantamiento de plataforma en Vercel (Frontend).</w:t>
+            </w:r>
+          </w:p>
+          <w:p>
+            <w:pPr>
+              <w:numPr>
+                <w:ilvl w:val="0"/>
+                <w:numId w:val="2"/>
+              </w:numPr>
+              <w:ind w:left="720" w:hanging="360"/>
+              <w:jc w:val="both"/>
+              <w:rPr>
+                <w:i w:val="1"/>
+                <w:iCs w:val="1"/>
+                <w:sz w:val="20"/>
+                <w:szCs w:val="20"/>
+                <w:u w:val="none"/>
+              </w:rPr>
+            </w:pPr>
+            <w:r>
+              <w:rPr>
+                <w:i w:val="1"/>
+                <w:iCs w:val="1"/>
+                <w:sz w:val="20"/>
+                <w:szCs w:val="20"/>
+                <w:rtl w:val="0"/>
+              </w:rPr>
+              <w:t xml:space="preserve">Conectividad en Supabase (Base de Datos y Autenticación de usuarios).</w:t>
+            </w:r>
+          </w:p>
+        </w:tc>
+      </w:tr>
+      <w:tr>
+        <w:trPr>
+          <w:cantSplit w:val="1"/>
+          <w:tblHeader w:val="0"/>
+        </w:trPr>
+        <w:tc>
+          <w:tcPr>
+            <w:vAlign w:val="center"/>
+          </w:tcPr>
+          <w:p>
+            <w:pPr>
+              <w:rPr>
+                <w:rFonts w:ascii="Calibri" w:cs="Calibri" w:eastAsia="Calibri" w:hAnsi="Calibri"/>
+                <w:color w:val="1f3864"/>
+              </w:rPr>
+            </w:pPr>
+            <w:r>
+              <w:rPr>
+                <w:rFonts w:ascii="Calibri" w:cs="Calibri" w:eastAsia="Calibri" w:hAnsi="Calibri"/>
+                <w:color w:val="1f3864"/>
+                <w:rtl w:val="0"/>
+              </w:rPr>
+              <w:t xml:space="preserve">Objetivos</w:t>
+            </w:r>
+          </w:p>
+        </w:tc>
+        <w:tc>
+          <w:tcPr>
+            <w:vAlign w:val="center"/>
+          </w:tcPr>
+          <w:p>
+            <w:pPr>
+              <w:jc w:val="both"/>
+              <w:rPr>
+                <w:i w:val="1"/>
+                <w:iCs w:val="1"/>
+                <w:sz w:val="20"/>
+                <w:szCs w:val="20"/>
+              </w:rPr>
+            </w:pPr>
+            <w:r>
+              <w:rPr>
+                <w:i w:val="1"/>
+                <w:iCs w:val="1"/>
+                <w:sz w:val="20"/>
+                <w:szCs w:val="20"/>
+                <w:rtl w:val="0"/>
+              </w:rPr>
+              <w:t xml:space="preserve">Los objetivos se mantienen de igual manera, con la adición del punto número 6 para la visibilidad de clientes del taller.</w:t>
+            </w:r>
+          </w:p>
+          <w:p>
+            <w:pPr>
+              <w:numPr>
+                <w:ilvl w:val="0"/>
+                <w:numId w:val="1"/>
+              </w:numPr>
+              <w:spacing w:after="0" w:afterAutospacing="0"/>
+              <w:ind w:left="720" w:hanging="360"/>
+              <w:jc w:val="both"/>
+              <w:rPr>
+                <w:i w:val="1"/>
+                <w:iCs w:val="1"/>
+                <w:sz w:val="20"/>
+                <w:szCs w:val="20"/>
+                <w:u w:val="none"/>
+              </w:rPr>
+            </w:pPr>
+            <w:r>
+              <w:rPr>
+                <w:i w:val="1"/>
+                <w:iCs w:val="1"/>
+                <w:sz w:val="20"/>
+                <w:szCs w:val="20"/>
+                <w:rtl w:val="0"/>
+              </w:rPr>
+              <w:t xml:space="preserve">Analizar y levantar los requerimientos del cliente, identificando sus necesidades, procesos actuales y principales dificultades en la gestión de pedidos, materiales y costos.</w:t>
+            </w:r>
+          </w:p>
+          <w:p>
+            <w:pPr>
+              <w:numPr>
+                <w:ilvl w:val="0"/>
+                <w:numId w:val="1"/>
+              </w:numPr>
+              <w:spacing w:after="0" w:afterAutospacing="0"/>
+              <w:ind w:left="720" w:hanging="360"/>
+              <w:jc w:val="both"/>
+              <w:rPr>
+                <w:i w:val="1"/>
+                <w:iCs w:val="1"/>
+                <w:sz w:val="20"/>
+                <w:szCs w:val="20"/>
+                <w:u w:val="none"/>
+              </w:rPr>
+            </w:pPr>
+            <w:r>
+              <w:rPr>
+                <w:i w:val="1"/>
+                <w:iCs w:val="1"/>
+                <w:sz w:val="20"/>
+                <w:szCs w:val="20"/>
+                <w:rtl w:val="0"/>
+              </w:rPr>
+              <w:t xml:space="preserve">Diseñar la estructura y funcionamiento del sistema web, definiendo la organización de la información, las funcionalidades y la interfaz de usuario de acuerdo con los requerimientos identificados.</w:t>
+            </w:r>
+          </w:p>
+          <w:p>
+            <w:pPr>
+              <w:numPr>
+                <w:ilvl w:val="0"/>
+                <w:numId w:val="1"/>
+              </w:numPr>
+              <w:spacing w:after="0" w:afterAutospacing="0"/>
+              <w:ind w:left="720" w:hanging="360"/>
+              <w:jc w:val="both"/>
+              <w:rPr>
+                <w:i w:val="1"/>
+                <w:iCs w:val="1"/>
+                <w:sz w:val="20"/>
+                <w:szCs w:val="20"/>
+                <w:u w:val="none"/>
+              </w:rPr>
+            </w:pPr>
+            <w:r>
+              <w:rPr>
+                <w:i w:val="1"/>
+                <w:iCs w:val="1"/>
+                <w:sz w:val="20"/>
+                <w:szCs w:val="20"/>
+                <w:rtl w:val="0"/>
+              </w:rPr>
+              <w:t xml:space="preserve">Desarrollar un sistema web de gestión interna que permita registrar, consultar y administrar información relacionada con pedidos, clientes, materiales y costos, centralizando los datos que actualmente son gestionados en papel.</w:t>
+            </w:r>
+          </w:p>
+          <w:p>
+            <w:pPr>
+              <w:numPr>
+                <w:ilvl w:val="0"/>
+                <w:numId w:val="1"/>
+              </w:numPr>
+              <w:spacing w:after="0" w:afterAutospacing="0"/>
+              <w:ind w:left="720" w:hanging="360"/>
+              <w:jc w:val="both"/>
+              <w:rPr>
+                <w:i w:val="1"/>
+                <w:iCs w:val="1"/>
+                <w:sz w:val="20"/>
+                <w:szCs w:val="20"/>
+                <w:u w:val="none"/>
+              </w:rPr>
+            </w:pPr>
+            <w:r>
+              <w:rPr>
+                <w:i w:val="1"/>
+                <w:iCs w:val="1"/>
+                <w:sz w:val="20"/>
+                <w:szCs w:val="20"/>
+                <w:rtl w:val="0"/>
+              </w:rPr>
+              <w:t xml:space="preserve">Implementar mecanismos de consulta y análisis de información histórica, permitiendo obtener métricas y reportes que faciliten el seguimiento de los pedidos y la gestión de los recursos.</w:t>
+            </w:r>
+          </w:p>
+          <w:p>
+            <w:pPr>
+              <w:numPr>
+                <w:ilvl w:val="0"/>
+                <w:numId w:val="1"/>
+              </w:numPr>
+              <w:spacing w:after="0" w:afterAutospacing="0"/>
+              <w:ind w:left="720" w:hanging="360"/>
+              <w:jc w:val="both"/>
+              <w:rPr>
+                <w:i w:val="1"/>
+                <w:iCs w:val="1"/>
+                <w:sz w:val="20"/>
+                <w:szCs w:val="20"/>
+                <w:u w:val="none"/>
+              </w:rPr>
+            </w:pPr>
+            <w:r>
+              <w:rPr>
+                <w:i w:val="1"/>
+                <w:iCs w:val="1"/>
+                <w:sz w:val="20"/>
+                <w:szCs w:val="20"/>
+                <w:rtl w:val="0"/>
+              </w:rPr>
+              <w:t xml:space="preserve">Realizar pruebas y validaciones con el cliente, verificando el correcto funcionamiento del sistema y determinando si las funcionalidades desarrolladas responden a las necesidades identificadas.</w:t>
+            </w:r>
+          </w:p>
+          <w:p>
+            <w:pPr>
+              <w:numPr>
+                <w:ilvl w:val="0"/>
+                <w:numId w:val="1"/>
+              </w:numPr>
+              <w:ind w:left="720" w:hanging="360"/>
+              <w:jc w:val="both"/>
+              <w:rPr>
+                <w:i w:val="1"/>
+                <w:iCs w:val="1"/>
+                <w:sz w:val="20"/>
+                <w:szCs w:val="20"/>
+                <w:u w:val="none"/>
+              </w:rPr>
+            </w:pPr>
+            <w:r>
+              <w:rPr>
+                <w:i w:val="1"/>
+                <w:iCs w:val="1"/>
+                <w:sz w:val="20"/>
+                <w:szCs w:val="20"/>
+                <w:rtl w:val="0"/>
+              </w:rPr>
+              <w:t xml:space="preserve">Diseñar y levantar una Landing Page para la visualización de información </w:t>
+            </w:r>
+            <w:r>
+              <w:rPr>
+                <w:i w:val="1"/>
+                <w:iCs w:val="1"/>
+                <w:sz w:val="20"/>
+                <w:szCs w:val="20"/>
+                <w:rtl w:val="0"/>
+              </w:rPr>
+              <w:t xml:space="preserve">relevantes</w:t>
+            </w:r>
+            <w:r>
+              <w:rPr>
+                <w:i w:val="1"/>
+                <w:iCs w:val="1"/>
+                <w:sz w:val="20"/>
+                <w:szCs w:val="20"/>
+                <w:rtl w:val="0"/>
+              </w:rPr>
+              <w:t xml:space="preserve"> para los clientes interesados, sea precios, servicios, preguntas frecuentes.</w:t>
+            </w:r>
+            <w:r>
+              <w:rPr>
+                <w:rtl w:val="0"/>
+              </w:rPr>
+            </w:r>
+          </w:p>
+        </w:tc>
+      </w:tr>
+      <w:tr>
+        <w:trPr>
+          <w:cantSplit w:val="1"/>
+          <w:tblHeader w:val="0"/>
+        </w:trPr>
+        <w:tc>
+          <w:tcPr>
+            <w:vAlign w:val="center"/>
+          </w:tcPr>
+          <w:p>
+            <w:pPr>
+              <w:rPr>
+                <w:rFonts w:ascii="Calibri" w:cs="Calibri" w:eastAsia="Calibri" w:hAnsi="Calibri"/>
+                <w:color w:val="1f3864"/>
+              </w:rPr>
+            </w:pPr>
+            <w:r>
+              <w:rPr>
+                <w:rFonts w:ascii="Calibri" w:cs="Calibri" w:eastAsia="Calibri" w:hAnsi="Calibri"/>
+                <w:color w:val="1f3864"/>
+                <w:rtl w:val="0"/>
+              </w:rPr>
+              <w:t xml:space="preserve">Metodología</w:t>
+            </w:r>
+          </w:p>
+        </w:tc>
+        <w:tc>
+          <w:tcPr>
+            <w:vAlign w:val="center"/>
+          </w:tcPr>
+          <w:p>
+            <w:pPr>
+              <w:jc w:val="both"/>
+              <w:rPr>
+                <w:i w:val="1"/>
+                <w:iCs w:val="1"/>
+                <w:sz w:val="20"/>
+                <w:szCs w:val="20"/>
+              </w:rPr>
+            </w:pPr>
+            <w:r>
+              <w:rPr>
+                <w:i w:val="1"/>
+                <w:iCs w:val="1"/>
+                <w:sz w:val="20"/>
+                <w:szCs w:val="20"/>
+                <w:rtl w:val="0"/>
+              </w:rPr>
+              <w:t xml:space="preserve">No se han realizado cambios a la metodología propuesta, por lo tanto, se mantiene la metodología de Sprint, mediante Scrum y en adición, tablero Kanban.</w:t>
+            </w:r>
+          </w:p>
+        </w:tc>
+      </w:tr>
+      <w:tr>
+        <w:trPr>
+          <w:cantSplit w:val="1"/>
+          <w:tblHeader w:val="0"/>
+        </w:trPr>
+        <w:tc>
+          <w:tcPr>
+            <w:vAlign w:val="center"/>
+          </w:tcPr>
+          <w:p>
+            <w:pPr>
+              <w:rPr>
+                <w:rFonts w:ascii="Calibri" w:cs="Calibri" w:eastAsia="Calibri" w:hAnsi="Calibri"/>
+                <w:color w:val="1f3864"/>
+              </w:rPr>
+            </w:pPr>
+            <w:r>
+              <w:rPr>
+                <w:rFonts w:ascii="Calibri" w:cs="Calibri" w:eastAsia="Calibri" w:hAnsi="Calibri"/>
+                <w:color w:val="1f3864"/>
+                <w:rtl w:val="0"/>
+              </w:rPr>
+              <w:t xml:space="preserve">Evidencias de avance</w:t>
+            </w:r>
+          </w:p>
+        </w:tc>
+        <w:tc>
+          <w:tcPr>
+            <w:vAlign w:val="center"/>
+          </w:tcPr>
+          <w:p>
+            <w:pPr>
+              <w:jc w:val="both"/>
+              <w:rPr>
+                <w:rFonts w:ascii="Calibri" w:cs="Calibri" w:eastAsia="Calibri" w:hAnsi="Calibri"/>
+                <w:b w:val="1"/>
+                <w:bCs w:val="1"/>
+                <w:i w:val="1"/>
+                <w:iCs w:val="1"/>
+                <w:sz w:val="20"/>
+                <w:szCs w:val="20"/>
+              </w:rPr>
+            </w:pPr>
+            <w:r>
+              <w:rPr>
+                <w:i w:val="1"/>
+                <w:iCs w:val="1"/>
+                <w:sz w:val="20"/>
+                <w:szCs w:val="20"/>
+                <w:rtl w:val="0"/>
+              </w:rPr>
+              <w:t xml:space="preserve">Carta Gantt, Documento de Requerimientos funcionales y no funcionales, Evidencias de reuniones con el cliente, Tablero Kanban, Sprint Retrospective, Sistema de gestión interna, Informe de pruebas y validación, Historias de usuario, Sprint backlog, Sprint Review, Burndown Chart, Daily meeting, Product backlog, Impediment log.</w:t>
+            </w:r>
+            <w:r>
+              <w:rPr>
+                <w:rtl w:val="0"/>
+              </w:rPr>
+            </w:r>
+          </w:p>
+        </w:tc>
+      </w:tr>
+      <w:tr>
+        <w:trPr>
+          <w:cantSplit w:val="1"/>
+          <w:tblHeader w:val="0"/>
+        </w:trPr>
+        <w:tc>
+          <w:tcPr>
+            <w:vAlign w:val="center"/>
+          </w:tcPr>
+          <w:p>
+            <w:pPr>
+              <w:rPr>
+                <w:rFonts w:ascii="Calibri" w:cs="Calibri" w:eastAsia="Calibri" w:hAnsi="Calibri"/>
+                <w:color w:val="1f3864"/>
+              </w:rPr>
+            </w:pPr>
+            <w:r>
+              <w:rPr>
+                <w:color w:val="1f3864"/>
+                <w:rtl w:val="0"/>
+              </w:rPr>
+              <w:t xml:space="preserve">Referencias Tecnológicas</w:t>
+            </w:r>
+            <w:r>
+              <w:rPr>
+                <w:rtl w:val="0"/>
+              </w:rPr>
+            </w:r>
+          </w:p>
+        </w:tc>
+        <w:tc>
+          <w:tcPr>
+            <w:vAlign w:val="center"/>
+          </w:tcPr>
+          <w:p>
+            <w:pPr>
+              <w:jc w:val="both"/>
+              <w:rPr>
+                <w:i w:val="1"/>
+                <w:iCs w:val="1"/>
+                <w:sz w:val="20"/>
+                <w:szCs w:val="20"/>
+              </w:rPr>
+            </w:pPr>
+            <w:r>
+              <w:rPr>
+                <w:i w:val="1"/>
+                <w:iCs w:val="1"/>
+                <w:sz w:val="20"/>
+                <w:szCs w:val="20"/>
+                <w:rtl w:val="0"/>
+              </w:rPr>
+              <w:t xml:space="preserve">Para el desarrollo del proyecto APT, se han utilizado las siguientes referencias tecnologías:</w:t>
             </w:r>
           </w:p>
           <w:p>
@@ -685,7 +1317,7 @@
                 <w:szCs w:val="20"/>
                 <w:rtl w:val="0"/>
               </w:rPr>
-              <w:t xml:space="preserve">Módulo de Visibilidad de Cliente (visualización de clientes)</w:t>
+              <w:t xml:space="preserve">Vercel para hosting y deploy del frontend (mediante conexión directa al repositorio del proyecto).</w:t>
             </w:r>
           </w:p>
           <w:p>
@@ -713,7 +1345,7 @@
                 <w:szCs w:val="20"/>
                 <w:rtl w:val="0"/>
               </w:rPr>
-              <w:t xml:space="preserve">Módulo de Gestión de Clientes (Jefa de Taller puede administrar clientes)</w:t>
+              <w:t xml:space="preserve">Supabase para el hosting de la base de datos relacional y autenticación de usuarios (PostgreSQL para la base de datos).</w:t>
             </w:r>
           </w:p>
           <w:p>
@@ -741,7 +1373,7 @@
                 <w:szCs w:val="20"/>
                 <w:rtl w:val="0"/>
               </w:rPr>
-              <w:t xml:space="preserve">Módulo de Gestión de Pedidos (Administración de pedidos de prendas)</w:t>
+              <w:t xml:space="preserve">React como tecnología de interfaz gráfica.</w:t>
             </w:r>
           </w:p>
           <w:p>
@@ -769,7 +1401,7 @@
                 <w:szCs w:val="20"/>
                 <w:rtl w:val="0"/>
               </w:rPr>
-              <w:t xml:space="preserve">Módulo de Flujo y Asignación de taller (Asignar trabajadores tareas)</w:t>
+              <w:t xml:space="preserve">NodeJS para el backend y lógica.</w:t>
             </w:r>
           </w:p>
           <w:p>
@@ -796,84 +1428,7 @@
                 <w:szCs w:val="20"/>
                 <w:rtl w:val="0"/>
               </w:rPr>
-              <w:t xml:space="preserve">Módulo de Autenticación y Control de Accesos (Integración con Supabase para el manejo de cuentas)</w:t>
-            </w:r>
-          </w:p>
-          <w:p>
-            <w:pPr>
-              <w:ind w:left="0" w:firstLine="0"/>
-              <w:jc w:val="both"/>
-              <w:rPr>
-                <w:i w:val="1"/>
-                <w:iCs w:val="1"/>
-                <w:sz w:val="20"/>
-                <w:szCs w:val="20"/>
-              </w:rPr>
-            </w:pPr>
-            <w:r>
-              <w:rPr>
-                <w:i w:val="1"/>
-                <w:iCs w:val="1"/>
-                <w:sz w:val="20"/>
-                <w:szCs w:val="20"/>
-                <w:rtl w:val="0"/>
-              </w:rPr>
-              <w:t xml:space="preserve">Otras actividades relacionadas a los módulos son las siguientes:</w:t>
-            </w:r>
-          </w:p>
-          <w:p>
-            <w:pPr>
-              <w:numPr>
-                <w:ilvl w:val="0"/>
-                <w:numId w:val="2"/>
-              </w:numPr>
-              <w:spacing w:after="0" w:afterAutospacing="0"/>
-              <w:ind w:left="720" w:hanging="360"/>
-              <w:jc w:val="both"/>
-              <w:rPr>
-                <w:i w:val="1"/>
-                <w:iCs w:val="1"/>
-                <w:sz w:val="20"/>
-                <w:szCs w:val="20"/>
-                <w:u w:val="none"/>
-              </w:rPr>
-            </w:pPr>
-            <w:r>
-              <w:rPr>
-                <w:i w:val="1"/>
-                <w:iCs w:val="1"/>
-                <w:sz w:val="20"/>
-                <w:szCs w:val="20"/>
-                <w:rtl w:val="0"/>
-              </w:rPr>
-              <w:t xml:space="preserve">Levantamiento de plataforma en Vercel (Frontend)</w:t>
-            </w:r>
-          </w:p>
-          <w:p>
-            <w:pPr>
-              <w:numPr>
-                <w:ilvl w:val="0"/>
-                <w:numId w:val="2"/>
-              </w:numPr>
-              <w:ind w:left="720" w:hanging="360"/>
-              <w:jc w:val="both"/>
-              <w:rPr>
-                <w:i w:val="1"/>
-                <w:iCs w:val="1"/>
-                <w:sz w:val="20"/>
-                <w:szCs w:val="20"/>
-                <w:u w:val="none"/>
-              </w:rPr>
-            </w:pPr>
-            <w:r>
-              <w:rPr>
-                <w:i w:val="1"/>
-                <w:iCs w:val="1"/>
-                <w:sz w:val="20"/>
-                <w:szCs w:val="20"/>
-                <w:rtl w:val="0"/>
-              </w:rPr>
-              <w:t xml:space="preserve">Conectividad en Supabase (Base de Datos y Autenticación de usuarios)</w:t>
+              <w:t xml:space="preserve">GitHub para el hosting del código fuente del proyecto.</w:t>
             </w:r>
           </w:p>
         </w:tc>
@@ -890,17 +1445,15 @@
           <w:p>
             <w:pPr>
               <w:rPr>
-                <w:rFonts w:ascii="Calibri" w:cs="Calibri" w:eastAsia="Calibri" w:hAnsi="Calibri"/>
                 <w:color w:val="1f3864"/>
               </w:rPr>
             </w:pPr>
             <w:r>
               <w:rPr>
-                <w:rFonts w:ascii="Calibri" w:cs="Calibri" w:eastAsia="Calibri" w:hAnsi="Calibri"/>
                 <w:color w:val="1f3864"/>
                 <w:rtl w:val="0"/>
               </w:rPr>
-              <w:t xml:space="preserve">Objetivos</w:t>
+              <w:t xml:space="preserve">Antecedentes Utilizados</w:t>
             </w:r>
           </w:p>
         </w:tc>
@@ -926,14 +1479,14 @@
                 <w:szCs w:val="20"/>
                 <w:rtl w:val="0"/>
               </w:rPr>
-              <w:t xml:space="preserve">Los objetivos se mantienen de igual manera, con la adición del punto número 6 para la visibilidad de clientes del taller.</w:t>
+              <w:t xml:space="preserve">Para el desarrollo del proyecto APT, se han utilizado las siguientes referencias de antecedentes:</w:t>
             </w:r>
           </w:p>
           <w:p>
             <w:pPr>
               <w:numPr>
                 <w:ilvl w:val="0"/>
-                <w:numId w:val="1"/>
+                <w:numId w:val="5"/>
               </w:numPr>
               <w:spacing w:after="0" w:afterAutospacing="0"/>
               <w:ind w:left="720" w:hanging="360"/>
@@ -943,25 +1496,24 @@
                 <w:iCs w:val="1"/>
                 <w:sz w:val="20"/>
                 <w:szCs w:val="20"/>
-                <w:u w:val="none"/>
-              </w:rPr>
-            </w:pPr>
-            <w:r>
-              <w:rPr>
-                <w:i w:val="1"/>
-                <w:iCs w:val="1"/>
-                <w:sz w:val="20"/>
-                <w:szCs w:val="20"/>
-                <w:rtl w:val="0"/>
-              </w:rPr>
-              <w:t xml:space="preserve">Analizar y levantar los requerimientos del cliente, identificando sus necesidades, procesos actuales y principales dificultades en la gestión de pedidos, materiales y costos.</w:t>
+              </w:rPr>
+            </w:pPr>
+            <w:r>
+              <w:rPr>
+                <w:i w:val="1"/>
+                <w:iCs w:val="1"/>
+                <w:sz w:val="20"/>
+                <w:szCs w:val="20"/>
+                <w:rtl w:val="0"/>
+              </w:rPr>
+              <w:t xml:space="preserve">Documento de Historias de usuario.</w:t>
             </w:r>
           </w:p>
           <w:p>
             <w:pPr>
               <w:numPr>
                 <w:ilvl w:val="0"/>
-                <w:numId w:val="1"/>
+                <w:numId w:val="5"/>
               </w:numPr>
               <w:spacing w:after="0" w:afterAutospacing="0"/>
               <w:ind w:left="720" w:hanging="360"/>
@@ -982,14 +1534,14 @@
                 <w:szCs w:val="20"/>
                 <w:rtl w:val="0"/>
               </w:rPr>
-              <w:t xml:space="preserve">Diseñar la estructura y funcionamiento del sistema web, definiendo la organización de la información, las funcionalidades y la interfaz de usuario de acuerdo con los requerimientos identificados.</w:t>
+              <w:t xml:space="preserve">Documento de Requerimientos funcionales y no funcionales.</w:t>
             </w:r>
           </w:p>
           <w:p>
             <w:pPr>
               <w:numPr>
                 <w:ilvl w:val="0"/>
-                <w:numId w:val="1"/>
+                <w:numId w:val="5"/>
               </w:numPr>
               <w:spacing w:after="0" w:afterAutospacing="0"/>
               <w:ind w:left="720" w:hanging="360"/>
@@ -1010,14 +1562,14 @@
                 <w:szCs w:val="20"/>
                 <w:rtl w:val="0"/>
               </w:rPr>
-              <w:t xml:space="preserve">Desarrollar un sistema web de gestión interna que permita registrar, consultar y administrar información relacionada con pedidos, clientes, materiales y costos, centralizando los datos que actualmente son gestionados en papel.</w:t>
+              <w:t xml:space="preserve">Carta Gantt/Cronograma.</w:t>
             </w:r>
           </w:p>
           <w:p>
             <w:pPr>
               <w:numPr>
                 <w:ilvl w:val="0"/>
-                <w:numId w:val="1"/>
+                <w:numId w:val="5"/>
               </w:numPr>
               <w:spacing w:after="0" w:afterAutospacing="0"/>
               <w:ind w:left="720" w:hanging="360"/>
@@ -1038,14 +1590,14 @@
                 <w:szCs w:val="20"/>
                 <w:rtl w:val="0"/>
               </w:rPr>
-              <w:t xml:space="preserve">Implementar mecanismos de consulta y análisis de información histórica, permitiendo obtener métricas y reportes que faciliten el seguimiento de los pedidos y la gestión de los recursos.</w:t>
+              <w:t xml:space="preserve">Documento de Sprint backlog.</w:t>
             </w:r>
           </w:p>
           <w:p>
             <w:pPr>
               <w:numPr>
                 <w:ilvl w:val="0"/>
-                <w:numId w:val="1"/>
+                <w:numId w:val="5"/>
               </w:numPr>
               <w:spacing w:after="0" w:afterAutospacing="0"/>
               <w:ind w:left="720" w:hanging="360"/>
@@ -1066,14 +1618,198 @@
                 <w:szCs w:val="20"/>
                 <w:rtl w:val="0"/>
               </w:rPr>
-              <w:t xml:space="preserve">Realizar pruebas y validaciones con el cliente, verificando el correcto funcionamiento del sistema y determinando si las funcionalidades desarrolladas responden a las necesidades identificadas</w:t>
+              <w:t xml:space="preserve">Documento de Product backlog.</w:t>
             </w:r>
           </w:p>
           <w:p>
             <w:pPr>
               <w:numPr>
                 <w:ilvl w:val="0"/>
-                <w:numId w:val="1"/>
+                <w:numId w:val="5"/>
+              </w:numPr>
+              <w:spacing w:after="0" w:afterAutospacing="0"/>
+              <w:ind w:left="720" w:hanging="360"/>
+              <w:jc w:val="both"/>
+              <w:rPr>
+                <w:i w:val="1"/>
+                <w:iCs w:val="1"/>
+                <w:sz w:val="20"/>
+                <w:szCs w:val="20"/>
+              </w:rPr>
+            </w:pPr>
+            <w:r>
+              <w:rPr>
+                <w:i w:val="1"/>
+                <w:iCs w:val="1"/>
+                <w:sz w:val="20"/>
+                <w:szCs w:val="20"/>
+                <w:rtl w:val="0"/>
+              </w:rPr>
+              <w:t xml:space="preserve">Documento de Burndown Chart.</w:t>
+            </w:r>
+          </w:p>
+          <w:p>
+            <w:pPr>
+              <w:numPr>
+                <w:ilvl w:val="0"/>
+                <w:numId w:val="5"/>
+              </w:numPr>
+              <w:spacing w:after="0" w:afterAutospacing="0"/>
+              <w:ind w:left="720" w:hanging="360"/>
+              <w:jc w:val="both"/>
+              <w:rPr>
+                <w:i w:val="1"/>
+                <w:iCs w:val="1"/>
+                <w:sz w:val="20"/>
+                <w:szCs w:val="20"/>
+              </w:rPr>
+            </w:pPr>
+            <w:r>
+              <w:rPr>
+                <w:i w:val="1"/>
+                <w:iCs w:val="1"/>
+                <w:sz w:val="20"/>
+                <w:szCs w:val="20"/>
+                <w:rtl w:val="0"/>
+              </w:rPr>
+              <w:t xml:space="preserve">Documento de </w:t>
+            </w:r>
+            <w:r>
+              <w:rPr>
+                <w:i w:val="1"/>
+                <w:iCs w:val="1"/>
+                <w:sz w:val="20"/>
+                <w:szCs w:val="20"/>
+                <w:rtl w:val="0"/>
+              </w:rPr>
+              <w:t xml:space="preserve">Reuniones</w:t>
+            </w:r>
+            <w:r>
+              <w:rPr>
+                <w:i w:val="1"/>
+                <w:iCs w:val="1"/>
+                <w:sz w:val="20"/>
+                <w:szCs w:val="20"/>
+                <w:rtl w:val="0"/>
+              </w:rPr>
+              <w:t xml:space="preserve"> con el cliente.</w:t>
+            </w:r>
+          </w:p>
+          <w:p>
+            <w:pPr>
+              <w:numPr>
+                <w:ilvl w:val="0"/>
+                <w:numId w:val="5"/>
+              </w:numPr>
+              <w:spacing w:after="0" w:afterAutospacing="0"/>
+              <w:ind w:left="720" w:hanging="360"/>
+              <w:jc w:val="both"/>
+              <w:rPr>
+                <w:i w:val="1"/>
+                <w:iCs w:val="1"/>
+                <w:sz w:val="20"/>
+                <w:szCs w:val="20"/>
+              </w:rPr>
+            </w:pPr>
+            <w:r>
+              <w:rPr>
+                <w:i w:val="1"/>
+                <w:iCs w:val="1"/>
+                <w:sz w:val="20"/>
+                <w:szCs w:val="20"/>
+                <w:rtl w:val="0"/>
+              </w:rPr>
+              <w:t xml:space="preserve">Documento de Impediment log.</w:t>
+            </w:r>
+          </w:p>
+          <w:p>
+            <w:pPr>
+              <w:numPr>
+                <w:ilvl w:val="0"/>
+                <w:numId w:val="5"/>
+              </w:numPr>
+              <w:spacing w:after="0" w:afterAutospacing="0"/>
+              <w:ind w:left="720" w:hanging="360"/>
+              <w:jc w:val="both"/>
+              <w:rPr>
+                <w:i w:val="1"/>
+                <w:iCs w:val="1"/>
+                <w:sz w:val="20"/>
+                <w:szCs w:val="20"/>
+              </w:rPr>
+            </w:pPr>
+            <w:r>
+              <w:rPr>
+                <w:i w:val="1"/>
+                <w:iCs w:val="1"/>
+                <w:sz w:val="20"/>
+                <w:szCs w:val="20"/>
+                <w:rtl w:val="0"/>
+              </w:rPr>
+              <w:t xml:space="preserve">Documento de Pruebas y Validación.</w:t>
+            </w:r>
+          </w:p>
+          <w:p>
+            <w:pPr>
+              <w:numPr>
+                <w:ilvl w:val="0"/>
+                <w:numId w:val="5"/>
+              </w:numPr>
+              <w:spacing w:after="0" w:afterAutospacing="0"/>
+              <w:ind w:left="720" w:hanging="360"/>
+              <w:jc w:val="both"/>
+              <w:rPr>
+                <w:i w:val="1"/>
+                <w:iCs w:val="1"/>
+                <w:sz w:val="20"/>
+                <w:szCs w:val="20"/>
+                <w:u w:val="none"/>
+              </w:rPr>
+            </w:pPr>
+            <w:r>
+              <w:rPr>
+                <w:i w:val="1"/>
+                <w:iCs w:val="1"/>
+                <w:sz w:val="20"/>
+                <w:szCs w:val="20"/>
+                <w:rtl w:val="0"/>
+              </w:rPr>
+              <w:t xml:space="preserve">Documento de Sprint Retrospective.</w:t>
+            </w:r>
+          </w:p>
+          <w:p>
+            <w:pPr>
+              <w:numPr>
+                <w:ilvl w:val="0"/>
+                <w:numId w:val="5"/>
+              </w:numPr>
+              <w:spacing w:after="0" w:afterAutospacing="0"/>
+              <w:ind w:left="720" w:hanging="360"/>
+              <w:jc w:val="both"/>
+              <w:rPr>
+                <w:i w:val="1"/>
+                <w:iCs w:val="1"/>
+                <w:sz w:val="20"/>
+                <w:szCs w:val="20"/>
+                <w:u w:val="none"/>
+              </w:rPr>
+            </w:pPr>
+            <w:r>
+              <w:rPr>
+                <w:i w:val="1"/>
+                <w:iCs w:val="1"/>
+                <w:sz w:val="20"/>
+                <w:szCs w:val="20"/>
+                <w:rtl w:val="0"/>
+              </w:rPr>
+              <w:t xml:space="preserve">Documento de Sprint Review.</w:t>
+            </w:r>
+          </w:p>
+          <w:p>
+            <w:pPr>
+              <w:numPr>
+                <w:ilvl w:val="0"/>
+                <w:numId w:val="5"/>
               </w:numPr>
               <w:ind w:left="720" w:hanging="360"/>
               <w:jc w:val="both"/>
@@ -1093,158 +1829,7 @@
                 <w:szCs w:val="20"/>
                 <w:rtl w:val="0"/>
               </w:rPr>
-              <w:t xml:space="preserve">Diseñar y levantar una Landing Page para la visualización de información </w:t>
-            </w:r>
-            <w:r>
-              <w:rPr>
-                <w:i w:val="1"/>
-                <w:iCs w:val="1"/>
-                <w:sz w:val="20"/>
-                <w:szCs w:val="20"/>
-                <w:rtl w:val="0"/>
-              </w:rPr>
-              <w:t xml:space="preserve">relevantes</w:t>
-            </w:r>
-            <w:r>
-              <w:rPr>
-                <w:i w:val="1"/>
-                <w:iCs w:val="1"/>
-                <w:sz w:val="20"/>
-                <w:szCs w:val="20"/>
-                <w:rtl w:val="0"/>
-              </w:rPr>
-              <w:t xml:space="preserve"> para los clientes interesados, sea precios, ,servicios, preguntas frecuentes. </w:t>
-            </w:r>
-          </w:p>
-          <w:p>
-            <w:pPr>
-              <w:jc w:val="both"/>
-              <w:rPr>
-                <w:i w:val="1"/>
-                <w:iCs w:val="1"/>
-                <w:color w:val="548dd4"/>
-                <w:sz w:val="20"/>
-                <w:szCs w:val="20"/>
-              </w:rPr>
-            </w:pPr>
-            <w:r>
-              <w:rPr>
-                <w:rtl w:val="0"/>
-              </w:rPr>
-            </w:r>
-          </w:p>
-        </w:tc>
-      </w:tr>
-      <w:tr>
-        <w:trPr>
-          <w:cantSplit w:val="1"/>
-          <w:tblHeader w:val="0"/>
-        </w:trPr>
-        <w:tc>
-          <w:tcPr>
-            <w:vAlign w:val="center"/>
-          </w:tcPr>
-          <w:p>
-            <w:pPr>
-              <w:rPr>
-                <w:rFonts w:ascii="Calibri" w:cs="Calibri" w:eastAsia="Calibri" w:hAnsi="Calibri"/>
-                <w:color w:val="1f3864"/>
-              </w:rPr>
-            </w:pPr>
-            <w:r>
-              <w:rPr>
-                <w:rFonts w:ascii="Calibri" w:cs="Calibri" w:eastAsia="Calibri" w:hAnsi="Calibri"/>
-                <w:color w:val="1f3864"/>
-                <w:rtl w:val="0"/>
-              </w:rPr>
-              <w:t xml:space="preserve">Metodología</w:t>
-            </w:r>
-          </w:p>
-        </w:tc>
-        <w:tc>
-          <w:tcPr>
-            <w:vAlign w:val="center"/>
-          </w:tcPr>
-          <w:p>
-            <w:pPr>
-              <w:jc w:val="both"/>
-              <w:rPr>
-                <w:i w:val="1"/>
-                <w:iCs w:val="1"/>
-                <w:sz w:val="20"/>
-                <w:szCs w:val="20"/>
-              </w:rPr>
-            </w:pPr>
-            <w:r>
-              <w:rPr>
-                <w:i w:val="1"/>
-                <w:iCs w:val="1"/>
-                <w:sz w:val="20"/>
-                <w:szCs w:val="20"/>
-                <w:rtl w:val="0"/>
-              </w:rPr>
-              <w:t xml:space="preserve">No se han realizado cambios a la metodología propuesta, por lo tanto, se mantiene la metodología de Sprint, mediante Scrum y en adición, tablero Kanban.</w:t>
-            </w:r>
-          </w:p>
-        </w:tc>
-      </w:tr>
-      <w:tr>
-        <w:trPr>
-          <w:cantSplit w:val="1"/>
-          <w:tblHeader w:val="0"/>
-        </w:trPr>
-        <w:tc>
-          <w:tcPr>
-            <w:vAlign w:val="center"/>
-          </w:tcPr>
-          <w:p>
-            <w:pPr>
-              <w:rPr>
-                <w:rFonts w:ascii="Calibri" w:cs="Calibri" w:eastAsia="Calibri" w:hAnsi="Calibri"/>
-                <w:color w:val="1f3864"/>
-              </w:rPr>
-            </w:pPr>
-            <w:r>
-              <w:rPr>
-                <w:rFonts w:ascii="Calibri" w:cs="Calibri" w:eastAsia="Calibri" w:hAnsi="Calibri"/>
-                <w:color w:val="1f3864"/>
-                <w:rtl w:val="0"/>
-              </w:rPr>
-              <w:t xml:space="preserve">Evidencias de avance</w:t>
-            </w:r>
-          </w:p>
-        </w:tc>
-        <w:tc>
-          <w:tcPr>
-            <w:vAlign w:val="center"/>
-          </w:tcPr>
-          <w:p>
-            <w:pPr>
-              <w:jc w:val="both"/>
-              <w:rPr>
-                <w:rFonts w:ascii="Calibri" w:cs="Calibri" w:eastAsia="Calibri" w:hAnsi="Calibri"/>
-                <w:b w:val="1"/>
-                <w:bCs w:val="1"/>
-                <w:i w:val="1"/>
-                <w:iCs w:val="1"/>
-                <w:sz w:val="20"/>
-                <w:szCs w:val="20"/>
-              </w:rPr>
-            </w:pPr>
-            <w:r>
-              <w:rPr>
-                <w:i w:val="1"/>
-                <w:iCs w:val="1"/>
-                <w:sz w:val="20"/>
-                <w:szCs w:val="20"/>
-                <w:rtl w:val="0"/>
-              </w:rPr>
-              <w:t xml:space="preserve">Carta Gantt, Documento de Requerimientos funcionales y no funcionales, Evidencias de reuniones con el cliente, Tablero Kanban, Sprint Retrospective, Sistema de gestión interna, Informe de pruebas y validación, Historias de usuario, Sprint backlog, Sprint Review, Burndown Chart, Daily meeting, Product backlog, Impediment log, </w:t>
-            </w:r>
-            <w:r>
-              <w:rPr>
-                <w:rtl w:val="0"/>
-              </w:rPr>
+              <w:t xml:space="preserve">Tablero Kanban.</w:t>
             </w:r>
           </w:p>
         </w:tc>
@@ -1851,7 +2436,7 @@
                 <w:szCs w:val="18"/>
                 <w:rtl w:val="0"/>
               </w:rPr>
-              <w:t xml:space="preserve">En Curso</w:t>
+              <w:t xml:space="preserve">En curso</w:t>
             </w:r>
           </w:p>
         </w:tc>
@@ -2045,7 +2630,7 @@
                 <w:szCs w:val="18"/>
                 <w:rtl w:val="0"/>
               </w:rPr>
-              <w:t xml:space="preserve">Hay reuniones que han tenido que ser aplazadas,y otras que han durado más de 1 hra</w:t>
+              <w:t xml:space="preserve">Hay reuniones que han tenido que ser aplazadas, y otras que han durado más de 1 hra</w:t>
             </w:r>
           </w:p>
         </w:tc>
@@ -2093,7 +2678,7 @@
                 <w:szCs w:val="18"/>
                 <w:rtl w:val="0"/>
               </w:rPr>
-              <w:t xml:space="preserve">Necesidades del clientes</w:t>
+              <w:t xml:space="preserve">Necesidades del cliente</w:t>
             </w:r>
           </w:p>
         </w:tc>
@@ -2783,7 +3368,7 @@
                 <w:szCs w:val="18"/>
                 <w:rtl w:val="0"/>
               </w:rPr>
-              <w:t xml:space="preserve">El cliente a estado bastante contento con el desarrollo de la web</w:t>
+              <w:t xml:space="preserve">El cliente ha estado bastante contento con el desarrollo de la web</w:t>
             </w:r>
           </w:p>
         </w:tc>
@@ -3181,7 +3766,7 @@
                 <w:szCs w:val="20"/>
                 <w:rtl w:val="0"/>
               </w:rPr>
-              <w:t xml:space="preserve">El único ajuste que hemos realizado ha sido la implementación de un módulo de servicios ya que la cliente no solamente hace confección de prendas sino que también ofrecía servicios de este tipo como arreglos a prendas, tales como cierres, modificación de tallas, entre otros dependiendo las necesidades del cliente.</w:t>
+              <w:t xml:space="preserve">El único ajuste que hemos realizado ha sido la implementación de un módulo de servicios ya que la cliente no solamente hace confección de prendas sino que también ofrecía servicios de este tipo como arreglos a prendas, tales como cierres, modificación de tallas, entre otros según las necesidades del cliente.</w:t>
             </w:r>
           </w:p>
           <w:p>
@@ -4063,6 +4648,226 @@
       </w:rPr>
     </w:lvl>
   </w:abstractNum>
+  <w:abstractNum w:abstractNumId="5">
+    <w:lvl w:ilvl="0">
+      <w:start w:val="1"/>
+      <w:numFmt w:val="bullet"/>
+      <w:lvlText w:val="●"/>
+      <w:lvlJc w:val="left"/>
+      <w:pPr>
+        <w:ind w:left="720" w:hanging="360"/>
+      </w:pPr>
+      <w:rPr>
+        <w:u w:val="none"/>
+      </w:rPr>
+    </w:lvl>
+    <w:lvl w:ilvl="1">
+      <w:start w:val="1"/>
+      <w:numFmt w:val="bullet"/>
+      <w:lvlText w:val="○"/>
+      <w:lvlJc w:val="left"/>
+      <w:pPr>
+        <w:ind w:left="1440" w:hanging="360"/>
+      </w:pPr>
+      <w:rPr>
+        <w:u w:val="none"/>
+      </w:rPr>
+    </w:lvl>
+    <w:lvl w:ilvl="2">
+      <w:start w:val="1"/>
+      <w:numFmt w:val="bullet"/>
+      <w:lvlText w:val="■"/>
+      <w:lvlJc w:val="left"/>
+      <w:pPr>
+        <w:ind w:left="2160" w:hanging="360"/>
+      </w:pPr>
+      <w:rPr>
+        <w:u w:val="none"/>
+      </w:rPr>
+    </w:lvl>
+    <w:lvl w:ilvl="3">
+      <w:start w:val="1"/>
+      <w:numFmt w:val="bullet"/>
+      <w:lvlText w:val="●"/>
+      <w:lvlJc w:val="left"/>
+      <w:pPr>
+        <w:ind w:left="2880" w:hanging="360"/>
+      </w:pPr>
+      <w:rPr>
+        <w:u w:val="none"/>
+      </w:rPr>
+    </w:lvl>
+    <w:lvl w:ilvl="4">
+      <w:start w:val="1"/>
+      <w:numFmt w:val="bullet"/>
+      <w:lvlText w:val="○"/>
+      <w:lvlJc w:val="left"/>
+      <w:pPr>
+        <w:ind w:left="3600" w:hanging="360"/>
+      </w:pPr>
+      <w:rPr>
+        <w:u w:val="none"/>
+      </w:rPr>
+    </w:lvl>
+    <w:lvl w:ilvl="5">
+      <w:start w:val="1"/>
+      <w:numFmt w:val="bullet"/>
+      <w:lvlText w:val="■"/>
+      <w:lvlJc w:val="left"/>
+      <w:pPr>
+        <w:ind w:left="4320" w:hanging="360"/>
+      </w:pPr>
+      <w:rPr>
+        <w:u w:val="none"/>
+      </w:rPr>
+    </w:lvl>
+    <w:lvl w:ilvl="6">
+      <w:start w:val="1"/>
+      <w:numFmt w:val="bullet"/>
+      <w:lvlText w:val="●"/>
+      <w:lvlJc w:val="left"/>
+      <w:pPr>
+        <w:ind w:left="5040" w:hanging="360"/>
+      </w:pPr>
+      <w:rPr>
+        <w:u w:val="none"/>
+      </w:rPr>
+    </w:lvl>
+    <w:lvl w:ilvl="7">
+      <w:start w:val="1"/>
+      <w:numFmt w:val="bullet"/>
+      <w:lvlText w:val="○"/>
+      <w:lvlJc w:val="left"/>
+      <w:pPr>
+        <w:ind w:left="5760" w:hanging="360"/>
+      </w:pPr>
+      <w:rPr>
+        <w:u w:val="none"/>
+      </w:rPr>
+    </w:lvl>
+    <w:lvl w:ilvl="8">
+      <w:start w:val="1"/>
+      <w:numFmt w:val="bullet"/>
+      <w:lvlText w:val="■"/>
+      <w:lvlJc w:val="left"/>
+      <w:pPr>
+        <w:ind w:left="6480" w:hanging="360"/>
+      </w:pPr>
+      <w:rPr>
+        <w:u w:val="none"/>
+      </w:rPr>
+    </w:lvl>
+  </w:abstractNum>
+  <w:abstractNum w:abstractNumId="6">
+    <w:lvl w:ilvl="0">
+      <w:start w:val="1"/>
+      <w:numFmt w:val="bullet"/>
+      <w:lvlText w:val="●"/>
+      <w:lvlJc w:val="left"/>
+      <w:pPr>
+        <w:ind w:left="720" w:hanging="360"/>
+      </w:pPr>
+      <w:rPr>
+        <w:u w:val="none"/>
+      </w:rPr>
+    </w:lvl>
+    <w:lvl w:ilvl="1">
+      <w:start w:val="1"/>
+      <w:numFmt w:val="bullet"/>
+      <w:lvlText w:val="○"/>
+      <w:lvlJc w:val="left"/>
+      <w:pPr>
+        <w:ind w:left="1440" w:hanging="360"/>
+      </w:pPr>
+      <w:rPr>
+        <w:u w:val="none"/>
+      </w:rPr>
+    </w:lvl>
+    <w:lvl w:ilvl="2">
+      <w:start w:val="1"/>
+      <w:numFmt w:val="bullet"/>
+      <w:lvlText w:val="■"/>
+      <w:lvlJc w:val="left"/>
+      <w:pPr>
+        <w:ind w:left="2160" w:hanging="360"/>
+      </w:pPr>
+      <w:rPr>
+        <w:u w:val="none"/>
+      </w:rPr>
+    </w:lvl>
+    <w:lvl w:ilvl="3">
+      <w:start w:val="1"/>
+      <w:numFmt w:val="bullet"/>
+      <w:lvlText w:val="●"/>
+      <w:lvlJc w:val="left"/>
+      <w:pPr>
+        <w:ind w:left="2880" w:hanging="360"/>
+      </w:pPr>
+      <w:rPr>
+        <w:u w:val="none"/>
+      </w:rPr>
+    </w:lvl>
+    <w:lvl w:ilvl="4">
+      <w:start w:val="1"/>
+      <w:numFmt w:val="bullet"/>
+      <w:lvlText w:val="○"/>
+      <w:lvlJc w:val="left"/>
+      <w:pPr>
+        <w:ind w:left="3600" w:hanging="360"/>
+      </w:pPr>
+      <w:rPr>
+        <w:u w:val="none"/>
+      </w:rPr>
+    </w:lvl>
+    <w:lvl w:ilvl="5">
+      <w:start w:val="1"/>
+      <w:numFmt w:val="bullet"/>
+      <w:lvlText w:val="■"/>
+      <w:lvlJc w:val="left"/>
+      <w:pPr>
+        <w:ind w:left="4320" w:hanging="360"/>
+      </w:pPr>
+      <w:rPr>
+        <w:u w:val="none"/>
+      </w:rPr>
+    </w:lvl>
+    <w:lvl w:ilvl="6">
+      <w:start w:val="1"/>
+      <w:numFmt w:val="bullet"/>
+      <w:lvlText w:val="●"/>
+      <w:lvlJc w:val="left"/>
+      <w:pPr>
+        <w:ind w:left="5040" w:hanging="360"/>
+      </w:pPr>
+      <w:rPr>
+        <w:u w:val="none"/>
+      </w:rPr>
+    </w:lvl>
+    <w:lvl w:ilvl="7">
+      <w:start w:val="1"/>
+      <w:numFmt w:val="bullet"/>
+      <w:lvlText w:val="○"/>
+      <w:lvlJc w:val="left"/>
+      <w:pPr>
+        <w:ind w:left="5760" w:hanging="360"/>
+      </w:pPr>
+      <w:rPr>
+        <w:u w:val="none"/>
+      </w:rPr>
+    </w:lvl>
+    <w:lvl w:ilvl="8">
+      <w:start w:val="1"/>
+      <w:numFmt w:val="bullet"/>
+      <w:lvlText w:val="■"/>
+      <w:lvlJc w:val="left"/>
+      <w:pPr>
+        <w:ind w:left="6480" w:hanging="360"/>
+      </w:pPr>
+      <w:rPr>
+        <w:u w:val="none"/>
+      </w:rPr>
+    </w:lvl>
+  </w:abstractNum>
   <w:num w:numId="1">
     <w:abstractNumId w:val="1"/>
   </w:num>
@@ -4074,6 +4879,12 @@
   </w:num>
   <w:num w:numId="4">
     <w:abstractNumId w:val="4"/>
+  </w:num>
+  <w:num w:numId="5">
+    <w:abstractNumId w:val="5"/>
+  </w:num>
+  <w:num w:numId="6">
+    <w:abstractNumId w:val="6"/>
   </w:num>
 </w:numbering>
 </file>

</xml_diff>